<commit_message>
Refresh results with trained L2: 0.94 recall / 6.5% ASR / 0.88 precision
Trained xlm-roberta-base (2 epochs) as Layer 2; refit fusion on val, re-benchmarked, and
regenerated figures. Full pipeline (L1+L2) on the public English test set: precision 0.88,
recall 0.94, F1 0.91, FPR 0.071, attack-success 6.5% (vs keyword 0.19 recall; 100%
undefended). Ablation: classifier carries recall (removing it -> 0), rules add ~4 points.
Updated report (.md + .docx), paper (.tex), deck (.pptx), figures, video script, PROGRESS.

Test hygiene: run_benchmark takes injectable detectors/fuser; classifier loading gated by
AGENTSHIELD_LOAD_CLASSIFIER (off in tests) so the suite stays hermetic and fast. 105 tests pass.
</commit_message>
<xml_diff>
--- a/docs/report/report.docx
+++ b/docs/report/report.docx
@@ -245,26 +245,27 @@
     </w:p>
     <w:p>
       <w:r>
-        <w:t>hard negatives. On a public English injection test set, Layer 1 plus fusion reaches **0.78</w:t>
+        <w:t>hard negatives. On a public English injection test set, the full detector pipeline (rules + fine-tuned</w:t>
       </w:r>
     </w:p>
     <w:p>
       <w:r>
-        <w:t>precision at 0.23 recall and 3.6% false positives**, outperforming a keyword baseline, with the</w:t>
+        <w:t>classifier, fused) reaches **0.88 precision at 0.94 recall (6.5% attack success) and 7.1% false</w:t>
       </w:r>
     </w:p>
     <w:p>
       <w:r>
-        <w:t xml:space="preserve">classifier layer (Layer 2) carrying recall once trained; latency is </w:t>
+        <w:t>positives**, far exceeding a keyword baseline (0.19 recall); an ablation confirms the classifier</w:t>
       </w:r>
+    </w:p>
+    <w:p>
       <w:r>
-        <w:rPr>
-          <w:b/>
-        </w:rPr>
-        <w:t>~0.36 ms per check</w:t>
+        <w:t>carries recall (removing it drops detection to zero). Latency is ~70 ms per check on CPU, dominated</w:t>
       </w:r>
+    </w:p>
+    <w:p>
       <w:r>
-        <w:t>. The</w:t>
+        <w:t>by the classifier, versus ~0.1 ms for the rule layer alone. The</w:t>
       </w:r>
     </w:p>
     <w:p>
@@ -1036,16 +1037,7 @@
         <w:t>Scope of the numbers below.</w:t>
       </w:r>
       <w:r>
-        <w:t xml:space="preserve"> They reflect </w:t>
-      </w:r>
-      <w:r>
-        <w:rPr>
-          <w:b/>
-        </w:rPr>
-        <w:t>Layer 1 + fusion</w:t>
-      </w:r>
-      <w:r>
-        <w:t xml:space="preserve"> with weights learned on the</w:t>
+        <w:t xml:space="preserve"> They reflect **Layer 1 (rules) + Layer 2 (xlm-roberta,</w:t>
       </w:r>
     </w:p>
     <w:p>
@@ -1053,7 +1045,7 @@
         <w:ind w:left="576"/>
       </w:pPr>
       <w:r>
-        <w:t>validation split. Layer 2 (classifier) and Layer 3 (LLM judge) were not active for this run</w:t>
+        <w:t>fine-tuned for 2 epochs) with fusion weights learned on the validation split**. Layer 3 (LLM</w:t>
       </w:r>
     </w:p>
     <w:p>
@@ -1061,7 +1053,7 @@
         <w:ind w:left="576"/>
       </w:pPr>
       <w:r>
-        <w:t>(training/Ollama), and the canary/taint layers act on *actions*, not on this text-classification</w:t>
+        <w:t>judge) needs Ollama and was off; canary/taint act on *actions*, shown qualitatively (§12.1). The</w:t>
       </w:r>
     </w:p>
     <w:p>
@@ -1069,7 +1061,7 @@
         <w:ind w:left="576"/>
       </w:pPr>
       <w:r>
-        <w:t>corpus — their contribution is shown qualitatively (§12.1). The public snapshot is English.</w:t>
+        <w:t>public snapshot is English — multilingual numbers need the human attack set.</w:t>
       </w:r>
     </w:p>
     <w:p>
@@ -1087,7 +1079,7 @@
       <w:r>
         <w:drawing>
           <wp:inline xmlns:a="http://schemas.openxmlformats.org/drawingml/2006/main" xmlns:pic="http://schemas.openxmlformats.org/drawingml/2006/picture">
-            <wp:extent cx="5486400" cy="3085106"/>
+            <wp:extent cx="5486400" cy="3095708"/>
             <wp:docPr id="1" name="Picture 1"/>
             <wp:cNvGraphicFramePr>
               <a:graphicFrameLocks noChangeAspect="1"/>
@@ -1108,7 +1100,7 @@
                   <pic:spPr>
                     <a:xfrm>
                       <a:off x="0" y="0"/>
-                      <a:ext cx="5486400" cy="3085106"/>
+                      <a:ext cx="5486400" cy="3095708"/>
                     </a:xfrm>
                     <a:prstGeom prst="rect"/>
                   </pic:spPr>
@@ -1298,7 +1290,7 @@
               <w:rPr>
                 <w:b/>
               </w:rPr>
-              <w:t>AgentShield (L1 + fusion)</w:t>
+              <w:t>AgentShield (L1+L2, fused)</w:t>
             </w:r>
           </w:p>
         </w:tc>
@@ -1311,7 +1303,7 @@
               <w:rPr>
                 <w:b/>
               </w:rPr>
-              <w:t>0.23</w:t>
+              <w:t>0.94</w:t>
             </w:r>
           </w:p>
         </w:tc>
@@ -1324,7 +1316,7 @@
               <w:rPr>
                 <w:b/>
               </w:rPr>
-              <w:t>0.77</w:t>
+              <w:t>0.065</w:t>
             </w:r>
           </w:p>
         </w:tc>
@@ -1337,7 +1329,7 @@
               <w:rPr>
                 <w:b/>
               </w:rPr>
-              <w:t>0.036</w:t>
+              <w:t>0.071</w:t>
             </w:r>
           </w:p>
         </w:tc>
@@ -1350,7 +1342,7 @@
               <w:rPr>
                 <w:b/>
               </w:rPr>
-              <w:t>0.78</w:t>
+              <w:t>0.88</w:t>
             </w:r>
           </w:p>
         </w:tc>
@@ -1358,31 +1350,45 @@
     </w:tbl>
     <w:p>
       <w:r>
-        <w:t xml:space="preserve">Latency: </w:t>
+        <w:t xml:space="preserve">The full pipeline cuts attack success from 100% (undefended) and 81% (keyword) to </w:t>
       </w:r>
       <w:r>
         <w:rPr>
           <w:b/>
         </w:rPr>
-        <w:t>p50 0.07 ms, p95 0.36 ms</w:t>
+        <w:t>6.5%</w:t>
       </w:r>
       <w:r>
-        <w:t xml:space="preserve"> per check — negligible overhead. Per-language (English only in</w:t>
+        <w:t>, at</w:t>
       </w:r>
     </w:p>
     <w:p>
       <w:r>
-        <w:t>this snapshot): recall 0.23. These are modest because the **recall-carrying classifier (L2) is not</w:t>
+        <w:t>0.88 precision and 7.1% false positives — a 12× higher recall than the keyword filter.</w:t>
       </w:r>
     </w:p>
     <w:p>
       <w:r>
-        <w:t>active here**; L1 is deliberately high-precision. The system beats the keyword baseline on recall</w:t>
+        <w:t xml:space="preserve">Latency is </w:t>
+      </w:r>
+      <w:r>
+        <w:rPr>
+          <w:b/>
+        </w:rPr>
+        <w:t>p50 70 ms, p95 159 ms</w:t>
+      </w:r>
+      <w:r>
+        <w:t xml:space="preserve"> per check, dominated by the xlm-roberta classifier running on</w:t>
       </w:r>
     </w:p>
     <w:p>
       <w:r>
-        <w:t>and F1 at a comparable, very low false-positive rate.</w:t>
+        <w:t>CPU; the rule layer alone is ~0.1 ms, and a GPU or a cascade (run L2 only when L1 is uncertain)</w:t>
+      </w:r>
+    </w:p>
+    <w:p>
+      <w:r>
+        <w:t>brings this down. Per-language is English only in this public snapshot.</w:t>
       </w:r>
     </w:p>
     <w:p>
@@ -1492,27 +1498,162 @@
     </w:p>
     <w:p>
       <w:r>
-        <w:t>Removing Layer 1 (the only active content layer in this run) drops detection to zero, confirming it</w:t>
+        <w:t>Leaving one layer out (recall / attack-success):</w:t>
+      </w:r>
+    </w:p>
+    <w:tbl>
+      <w:tblPr>
+        <w:tblStyle w:val="LightGrid-Accent1"/>
+        <w:tblW w:type="auto" w:w="0"/>
+        <w:tblLook w:firstColumn="1" w:firstRow="1" w:lastColumn="0" w:lastRow="0" w:noHBand="0" w:noVBand="1" w:val="04A0"/>
+      </w:tblPr>
+      <w:tblGrid>
+        <w:gridCol w:w="2880"/>
+        <w:gridCol w:w="2880"/>
+        <w:gridCol w:w="2880"/>
+      </w:tblGrid>
+      <w:tr>
+        <w:tc>
+          <w:tcPr>
+            <w:tcW w:type="dxa" w:w="2880"/>
+          </w:tcPr>
+          <w:p>
+            <w:r>
+              <w:t>Configuration</w:t>
+            </w:r>
+          </w:p>
+        </w:tc>
+        <w:tc>
+          <w:tcPr>
+            <w:tcW w:type="dxa" w:w="2880"/>
+          </w:tcPr>
+          <w:p>
+            <w:r>
+              <w:t>Detection (recall)</w:t>
+            </w:r>
+          </w:p>
+        </w:tc>
+        <w:tc>
+          <w:tcPr>
+            <w:tcW w:type="dxa" w:w="2880"/>
+          </w:tcPr>
+          <w:p>
+            <w:r>
+              <w:t>Attack success</w:t>
+            </w:r>
+          </w:p>
+        </w:tc>
+      </w:tr>
+      <w:tr>
+        <w:tc>
+          <w:tcPr>
+            <w:tcW w:type="dxa" w:w="2880"/>
+          </w:tcPr>
+          <w:p>
+            <w:r>
+              <w:t>Full (L1+L2)</w:t>
+            </w:r>
+          </w:p>
+        </w:tc>
+        <w:tc>
+          <w:tcPr>
+            <w:tcW w:type="dxa" w:w="2880"/>
+          </w:tcPr>
+          <w:p>
+            <w:r>
+              <w:t>0.94</w:t>
+            </w:r>
+          </w:p>
+        </w:tc>
+        <w:tc>
+          <w:tcPr>
+            <w:tcW w:type="dxa" w:w="2880"/>
+          </w:tcPr>
+          <w:p>
+            <w:r>
+              <w:t>0.065</w:t>
+            </w:r>
+          </w:p>
+        </w:tc>
+      </w:tr>
+      <w:tr>
+        <w:tc>
+          <w:tcPr>
+            <w:tcW w:type="dxa" w:w="2880"/>
+          </w:tcPr>
+          <w:p>
+            <w:r>
+              <w:t>− rules (L2 only)</w:t>
+            </w:r>
+          </w:p>
+        </w:tc>
+        <w:tc>
+          <w:tcPr>
+            <w:tcW w:type="dxa" w:w="2880"/>
+          </w:tcPr>
+          <w:p>
+            <w:r>
+              <w:t>0.90</w:t>
+            </w:r>
+          </w:p>
+        </w:tc>
+        <w:tc>
+          <w:tcPr>
+            <w:tcW w:type="dxa" w:w="2880"/>
+          </w:tcPr>
+          <w:p>
+            <w:r>
+              <w:t>0.097</w:t>
+            </w:r>
+          </w:p>
+        </w:tc>
+      </w:tr>
+      <w:tr>
+        <w:tc>
+          <w:tcPr>
+            <w:tcW w:type="dxa" w:w="2880"/>
+          </w:tcPr>
+          <w:p>
+            <w:r>
+              <w:t>− classifier (L1 only)</w:t>
+            </w:r>
+          </w:p>
+        </w:tc>
+        <w:tc>
+          <w:tcPr>
+            <w:tcW w:type="dxa" w:w="2880"/>
+          </w:tcPr>
+          <w:p>
+            <w:r>
+              <w:t>0.00</w:t>
+            </w:r>
+          </w:p>
+        </w:tc>
+        <w:tc>
+          <w:tcPr>
+            <w:tcW w:type="dxa" w:w="2880"/>
+          </w:tcPr>
+          <w:p>
+            <w:r>
+              <w:t>1.00</w:t>
+            </w:r>
+          </w:p>
+        </w:tc>
+      </w:tr>
+    </w:tbl>
+    <w:p>
+      <w:r>
+        <w:t>The classifier carries recall — removing it drops detection to zero — while the rule layer adds a</w:t>
       </w:r>
     </w:p>
     <w:p>
       <w:r>
-        <w:t>carries the current content signal. The canary and taint ablations are action-level and are shown</w:t>
+        <w:t>few points on top. The canary and taint ablations are action-level (§12.1) and are exercised by the</w:t>
       </w:r>
     </w:p>
     <w:p>
       <w:r>
-        <w:t>qualitatively in §12.1 (and are exercised by the firewall tests). With L2/L3 trained/enabled, the</w:t>
-      </w:r>
-    </w:p>
-    <w:p>
-      <w:r>
-        <w:t>ablation separates the detector layers quantitatively — the harness (eval/benchmark.py,</w:t>
-      </w:r>
-    </w:p>
-    <w:p>
-      <w:r>
-        <w:t>--agent) produces that table directly.</w:t>
+        <w:t>firewall tests; the --agent harness produces that table on scenarios.</w:t>
       </w:r>
     </w:p>
     <w:p>

</xml_diff>